<commit_message>
Implement Summary Table checker initial
</commit_message>
<xml_diff>
--- a/docs/report1/LS2502 - Final Draft R2.docx
+++ b/docs/report1/LS2502 - Final Draft R2.docx
@@ -928,17 +928,8 @@
                 <w:rStyle w:val="spellingerror"/>
                 <w:rFonts w:ascii="Palatino Linotype" w:hAnsi="Palatino Linotype"/>
               </w:rPr>
-              <w:t xml:space="preserve">Mahdi </w:t>
-            </w:r>
-            <w:proofErr w:type="spellStart"/>
-            <w:r>
-              <w:rPr>
-                <w:rStyle w:val="spellingerror"/>
-                <w:rFonts w:ascii="Palatino Linotype" w:hAnsi="Palatino Linotype"/>
-              </w:rPr>
-              <w:t>Bonyaniakbarabadi</w:t>
-            </w:r>
-            <w:proofErr w:type="spellEnd"/>
+              <w:t>Mahdi Bonyaniakbarabadi</w:t>
+            </w:r>
             <w:r>
               <w:rPr>
                 <w:rStyle w:val="spellingerror"/>
@@ -1229,15 +1220,7 @@
         <w:t xml:space="preserve">, and </w:t>
       </w:r>
       <w:r>
-        <w:t xml:space="preserve">Mahdi </w:t>
-      </w:r>
-      <w:proofErr w:type="spellStart"/>
-      <w:r>
-        <w:t>Bonyaniakbarabadi</w:t>
-      </w:r>
-      <w:proofErr w:type="spellEnd"/>
-      <w:r>
-        <w:t xml:space="preserve"> </w:t>
+        <w:t xml:space="preserve">Mahdi Bonyaniakbarabadi </w:t>
       </w:r>
       <w:r>
         <w:t>were the Student Engineers</w:t>
@@ -7008,7 +6991,6 @@
         <w:tc>
           <w:tcPr>
             <w:tcW w:w="5212" w:type="dxa"/>
-            <w:shd w:val="clear" w:color="auto" w:fill="auto"/>
             <w:vAlign w:val="center"/>
           </w:tcPr>
           <w:p>
@@ -7281,7 +7263,6 @@
         <w:tc>
           <w:tcPr>
             <w:tcW w:w="4148" w:type="dxa"/>
-            <w:shd w:val="clear" w:color="auto" w:fill="auto"/>
             <w:vAlign w:val="center"/>
           </w:tcPr>
           <w:p>
@@ -8500,7 +8481,6 @@
         <w:tc>
           <w:tcPr>
             <w:tcW w:w="2034" w:type="pct"/>
-            <w:shd w:val="clear" w:color="auto" w:fill="auto"/>
             <w:noWrap/>
             <w:vAlign w:val="center"/>
             <w:hideMark/>
@@ -8526,7 +8506,6 @@
         <w:tc>
           <w:tcPr>
             <w:tcW w:w="1166" w:type="pct"/>
-            <w:shd w:val="clear" w:color="auto" w:fill="auto"/>
             <w:noWrap/>
             <w:vAlign w:val="center"/>
             <w:hideMark/>
@@ -8556,7 +8535,6 @@
         <w:tc>
           <w:tcPr>
             <w:tcW w:w="1800" w:type="pct"/>
-            <w:shd w:val="clear" w:color="auto" w:fill="auto"/>
             <w:noWrap/>
             <w:vAlign w:val="center"/>
             <w:hideMark/>
@@ -8592,7 +8570,6 @@
         <w:tc>
           <w:tcPr>
             <w:tcW w:w="2034" w:type="pct"/>
-            <w:shd w:val="clear" w:color="auto" w:fill="auto"/>
             <w:noWrap/>
             <w:vAlign w:val="center"/>
           </w:tcPr>
@@ -8617,7 +8594,6 @@
         <w:tc>
           <w:tcPr>
             <w:tcW w:w="1166" w:type="pct"/>
-            <w:shd w:val="clear" w:color="auto" w:fill="auto"/>
             <w:noWrap/>
             <w:vAlign w:val="center"/>
           </w:tcPr>
@@ -8640,7 +8616,6 @@
         <w:tc>
           <w:tcPr>
             <w:tcW w:w="1800" w:type="pct"/>
-            <w:shd w:val="clear" w:color="auto" w:fill="auto"/>
             <w:noWrap/>
             <w:vAlign w:val="center"/>
           </w:tcPr>
@@ -8672,7 +8647,6 @@
         <w:tc>
           <w:tcPr>
             <w:tcW w:w="2034" w:type="pct"/>
-            <w:shd w:val="clear" w:color="auto" w:fill="auto"/>
             <w:noWrap/>
             <w:vAlign w:val="center"/>
           </w:tcPr>
@@ -8697,7 +8671,6 @@
         <w:tc>
           <w:tcPr>
             <w:tcW w:w="1166" w:type="pct"/>
-            <w:shd w:val="clear" w:color="auto" w:fill="auto"/>
             <w:noWrap/>
             <w:vAlign w:val="center"/>
           </w:tcPr>
@@ -8720,7 +8693,6 @@
         <w:tc>
           <w:tcPr>
             <w:tcW w:w="1800" w:type="pct"/>
-            <w:shd w:val="clear" w:color="auto" w:fill="auto"/>
             <w:noWrap/>
           </w:tcPr>
           <w:p>
@@ -8751,7 +8723,6 @@
         <w:tc>
           <w:tcPr>
             <w:tcW w:w="2034" w:type="pct"/>
-            <w:shd w:val="clear" w:color="auto" w:fill="auto"/>
             <w:noWrap/>
             <w:vAlign w:val="center"/>
           </w:tcPr>
@@ -8776,7 +8747,6 @@
         <w:tc>
           <w:tcPr>
             <w:tcW w:w="1166" w:type="pct"/>
-            <w:shd w:val="clear" w:color="auto" w:fill="auto"/>
             <w:noWrap/>
             <w:vAlign w:val="center"/>
           </w:tcPr>
@@ -8808,7 +8778,6 @@
         <w:tc>
           <w:tcPr>
             <w:tcW w:w="1800" w:type="pct"/>
-            <w:shd w:val="clear" w:color="auto" w:fill="auto"/>
             <w:noWrap/>
             <w:vAlign w:val="center"/>
           </w:tcPr>
@@ -9813,7 +9782,6 @@
         <w:tc>
           <w:tcPr>
             <w:tcW w:w="173" w:type="pct"/>
-            <w:shd w:val="clear" w:color="auto" w:fill="auto"/>
             <w:vAlign w:val="center"/>
             <w:hideMark/>
           </w:tcPr>
@@ -9869,7 +9837,6 @@
         <w:tc>
           <w:tcPr>
             <w:tcW w:w="887" w:type="pct"/>
-            <w:shd w:val="clear" w:color="auto" w:fill="auto"/>
             <w:vAlign w:val="center"/>
             <w:hideMark/>
           </w:tcPr>
@@ -9898,7 +9865,6 @@
         <w:tc>
           <w:tcPr>
             <w:tcW w:w="531" w:type="pct"/>
-            <w:shd w:val="clear" w:color="auto" w:fill="auto"/>
             <w:vAlign w:val="center"/>
             <w:hideMark/>
           </w:tcPr>
@@ -9927,7 +9893,6 @@
         <w:tc>
           <w:tcPr>
             <w:tcW w:w="417" w:type="pct"/>
-            <w:shd w:val="clear" w:color="auto" w:fill="auto"/>
             <w:vAlign w:val="center"/>
             <w:hideMark/>
           </w:tcPr>
@@ -10088,7 +10053,6 @@
         <w:tc>
           <w:tcPr>
             <w:tcW w:w="417" w:type="pct"/>
-            <w:shd w:val="clear" w:color="auto" w:fill="auto"/>
             <w:vAlign w:val="center"/>
             <w:hideMark/>
           </w:tcPr>
@@ -10117,7 +10081,6 @@
         <w:tc>
           <w:tcPr>
             <w:tcW w:w="418" w:type="pct"/>
-            <w:shd w:val="clear" w:color="auto" w:fill="auto"/>
             <w:vAlign w:val="center"/>
             <w:hideMark/>
           </w:tcPr>
@@ -10165,7 +10128,6 @@
         <w:tc>
           <w:tcPr>
             <w:tcW w:w="366" w:type="pct"/>
-            <w:shd w:val="clear" w:color="auto" w:fill="auto"/>
             <w:vAlign w:val="center"/>
             <w:hideMark/>
           </w:tcPr>
@@ -10226,7 +10188,6 @@
         <w:tc>
           <w:tcPr>
             <w:tcW w:w="401" w:type="pct"/>
-            <w:shd w:val="clear" w:color="auto" w:fill="auto"/>
             <w:vAlign w:val="center"/>
             <w:hideMark/>
           </w:tcPr>
@@ -10282,7 +10243,6 @@
         <w:tc>
           <w:tcPr>
             <w:tcW w:w="173" w:type="pct"/>
-            <w:shd w:val="clear" w:color="auto" w:fill="auto"/>
             <w:vAlign w:val="center"/>
           </w:tcPr>
           <w:p>
@@ -10337,7 +10297,6 @@
         <w:tc>
           <w:tcPr>
             <w:tcW w:w="887" w:type="pct"/>
-            <w:shd w:val="clear" w:color="auto" w:fill="auto"/>
             <w:vAlign w:val="center"/>
           </w:tcPr>
           <w:p>
@@ -10365,7 +10324,6 @@
         <w:tc>
           <w:tcPr>
             <w:tcW w:w="531" w:type="pct"/>
-            <w:shd w:val="clear" w:color="auto" w:fill="auto"/>
             <w:vAlign w:val="center"/>
           </w:tcPr>
           <w:p>
@@ -10389,7 +10347,6 @@
         <w:tc>
           <w:tcPr>
             <w:tcW w:w="417" w:type="pct"/>
-            <w:shd w:val="clear" w:color="auto" w:fill="auto"/>
             <w:vAlign w:val="center"/>
           </w:tcPr>
           <w:p>
@@ -10465,7 +10422,6 @@
         <w:tc>
           <w:tcPr>
             <w:tcW w:w="417" w:type="pct"/>
-            <w:shd w:val="clear" w:color="auto" w:fill="auto"/>
             <w:vAlign w:val="center"/>
           </w:tcPr>
           <w:p>
@@ -10491,7 +10447,6 @@
         <w:tc>
           <w:tcPr>
             <w:tcW w:w="418" w:type="pct"/>
-            <w:shd w:val="clear" w:color="auto" w:fill="auto"/>
             <w:vAlign w:val="center"/>
           </w:tcPr>
           <w:p>
@@ -10515,7 +10470,6 @@
         <w:tc>
           <w:tcPr>
             <w:tcW w:w="366" w:type="pct"/>
-            <w:shd w:val="clear" w:color="auto" w:fill="auto"/>
             <w:vAlign w:val="center"/>
           </w:tcPr>
           <w:p>
@@ -10543,7 +10497,6 @@
         <w:tc>
           <w:tcPr>
             <w:tcW w:w="401" w:type="pct"/>
-            <w:shd w:val="clear" w:color="auto" w:fill="auto"/>
             <w:vAlign w:val="center"/>
           </w:tcPr>
           <w:p>
@@ -10573,7 +10526,6 @@
         <w:tc>
           <w:tcPr>
             <w:tcW w:w="173" w:type="pct"/>
-            <w:shd w:val="clear" w:color="auto" w:fill="auto"/>
             <w:vAlign w:val="center"/>
           </w:tcPr>
           <w:p>
@@ -10628,7 +10580,6 @@
         <w:tc>
           <w:tcPr>
             <w:tcW w:w="887" w:type="pct"/>
-            <w:shd w:val="clear" w:color="auto" w:fill="auto"/>
             <w:vAlign w:val="center"/>
           </w:tcPr>
           <w:p>
@@ -10654,7 +10605,6 @@
         <w:tc>
           <w:tcPr>
             <w:tcW w:w="531" w:type="pct"/>
-            <w:shd w:val="clear" w:color="auto" w:fill="auto"/>
             <w:vAlign w:val="center"/>
           </w:tcPr>
           <w:p>
@@ -10679,7 +10629,6 @@
         <w:tc>
           <w:tcPr>
             <w:tcW w:w="417" w:type="pct"/>
-            <w:shd w:val="clear" w:color="auto" w:fill="auto"/>
             <w:vAlign w:val="center"/>
           </w:tcPr>
           <w:p>
@@ -10752,7 +10701,6 @@
         <w:tc>
           <w:tcPr>
             <w:tcW w:w="417" w:type="pct"/>
-            <w:shd w:val="clear" w:color="auto" w:fill="auto"/>
             <w:vAlign w:val="center"/>
           </w:tcPr>
           <w:p>
@@ -10770,14 +10718,20 @@
                 <w:sz w:val="16"/>
                 <w:szCs w:val="16"/>
               </w:rPr>
-              <w:t>2,792</w:t>
+              <w:t>2,79</w:t>
+            </w:r>
+            <w:r>
+              <w:rPr>
+                <w:sz w:val="16"/>
+                <w:szCs w:val="16"/>
+              </w:rPr>
+              <w:t>222</w:t>
             </w:r>
           </w:p>
         </w:tc>
         <w:tc>
           <w:tcPr>
             <w:tcW w:w="418" w:type="pct"/>
-            <w:shd w:val="clear" w:color="auto" w:fill="auto"/>
             <w:vAlign w:val="center"/>
           </w:tcPr>
           <w:p>
@@ -10801,7 +10755,6 @@
         <w:tc>
           <w:tcPr>
             <w:tcW w:w="366" w:type="pct"/>
-            <w:shd w:val="clear" w:color="auto" w:fill="auto"/>
             <w:vAlign w:val="center"/>
           </w:tcPr>
           <w:p>
@@ -10826,7 +10779,6 @@
         <w:tc>
           <w:tcPr>
             <w:tcW w:w="401" w:type="pct"/>
-            <w:shd w:val="clear" w:color="auto" w:fill="auto"/>
             <w:vAlign w:val="center"/>
           </w:tcPr>
           <w:p>
@@ -10864,7 +10816,6 @@
         <w:tc>
           <w:tcPr>
             <w:tcW w:w="173" w:type="pct"/>
-            <w:shd w:val="clear" w:color="auto" w:fill="auto"/>
             <w:vAlign w:val="center"/>
           </w:tcPr>
           <w:p>
@@ -10920,7 +10871,6 @@
         <w:tc>
           <w:tcPr>
             <w:tcW w:w="887" w:type="pct"/>
-            <w:shd w:val="clear" w:color="auto" w:fill="auto"/>
             <w:vAlign w:val="center"/>
           </w:tcPr>
           <w:p>
@@ -10946,7 +10896,6 @@
         <w:tc>
           <w:tcPr>
             <w:tcW w:w="531" w:type="pct"/>
-            <w:shd w:val="clear" w:color="auto" w:fill="auto"/>
             <w:vAlign w:val="center"/>
           </w:tcPr>
           <w:p>
@@ -10971,7 +10920,6 @@
         <w:tc>
           <w:tcPr>
             <w:tcW w:w="417" w:type="pct"/>
-            <w:shd w:val="clear" w:color="auto" w:fill="auto"/>
             <w:vAlign w:val="center"/>
           </w:tcPr>
           <w:p>
@@ -11042,7 +10990,6 @@
         <w:tc>
           <w:tcPr>
             <w:tcW w:w="417" w:type="pct"/>
-            <w:shd w:val="clear" w:color="auto" w:fill="auto"/>
             <w:vAlign w:val="center"/>
           </w:tcPr>
           <w:p>
@@ -11067,7 +11014,6 @@
         <w:tc>
           <w:tcPr>
             <w:tcW w:w="418" w:type="pct"/>
-            <w:shd w:val="clear" w:color="auto" w:fill="auto"/>
             <w:vAlign w:val="center"/>
           </w:tcPr>
           <w:p>
@@ -11091,7 +11037,6 @@
         <w:tc>
           <w:tcPr>
             <w:tcW w:w="366" w:type="pct"/>
-            <w:shd w:val="clear" w:color="auto" w:fill="auto"/>
             <w:vAlign w:val="center"/>
           </w:tcPr>
           <w:p>
@@ -11116,7 +11061,6 @@
         <w:tc>
           <w:tcPr>
             <w:tcW w:w="401" w:type="pct"/>
-            <w:shd w:val="clear" w:color="auto" w:fill="auto"/>
             <w:vAlign w:val="center"/>
           </w:tcPr>
           <w:p>
@@ -11147,7 +11091,6 @@
         <w:tc>
           <w:tcPr>
             <w:tcW w:w="173" w:type="pct"/>
-            <w:shd w:val="clear" w:color="auto" w:fill="auto"/>
             <w:vAlign w:val="center"/>
           </w:tcPr>
           <w:p>
@@ -11206,7 +11149,6 @@
         <w:tc>
           <w:tcPr>
             <w:tcW w:w="887" w:type="pct"/>
-            <w:shd w:val="clear" w:color="auto" w:fill="auto"/>
             <w:vAlign w:val="center"/>
           </w:tcPr>
           <w:p>
@@ -11232,7 +11174,6 @@
         <w:tc>
           <w:tcPr>
             <w:tcW w:w="531" w:type="pct"/>
-            <w:shd w:val="clear" w:color="auto" w:fill="auto"/>
             <w:vAlign w:val="center"/>
           </w:tcPr>
           <w:p>
@@ -11257,7 +11198,6 @@
         <w:tc>
           <w:tcPr>
             <w:tcW w:w="417" w:type="pct"/>
-            <w:shd w:val="clear" w:color="auto" w:fill="auto"/>
             <w:vAlign w:val="center"/>
           </w:tcPr>
           <w:p>
@@ -11328,7 +11268,6 @@
         <w:tc>
           <w:tcPr>
             <w:tcW w:w="417" w:type="pct"/>
-            <w:shd w:val="clear" w:color="auto" w:fill="auto"/>
             <w:vAlign w:val="center"/>
           </w:tcPr>
           <w:p>
@@ -11354,7 +11293,6 @@
         <w:tc>
           <w:tcPr>
             <w:tcW w:w="418" w:type="pct"/>
-            <w:shd w:val="clear" w:color="auto" w:fill="auto"/>
             <w:vAlign w:val="center"/>
           </w:tcPr>
           <w:p>
@@ -11378,7 +11316,6 @@
         <w:tc>
           <w:tcPr>
             <w:tcW w:w="366" w:type="pct"/>
-            <w:shd w:val="clear" w:color="auto" w:fill="auto"/>
             <w:vAlign w:val="center"/>
           </w:tcPr>
           <w:p>
@@ -11404,7 +11341,6 @@
         <w:tc>
           <w:tcPr>
             <w:tcW w:w="401" w:type="pct"/>
-            <w:shd w:val="clear" w:color="auto" w:fill="auto"/>
             <w:vAlign w:val="center"/>
           </w:tcPr>
           <w:p>
@@ -11434,7 +11370,6 @@
         <w:tc>
           <w:tcPr>
             <w:tcW w:w="173" w:type="pct"/>
-            <w:shd w:val="clear" w:color="auto" w:fill="auto"/>
             <w:vAlign w:val="center"/>
           </w:tcPr>
           <w:p>
@@ -11493,7 +11428,6 @@
         <w:tc>
           <w:tcPr>
             <w:tcW w:w="887" w:type="pct"/>
-            <w:shd w:val="clear" w:color="auto" w:fill="auto"/>
             <w:vAlign w:val="center"/>
           </w:tcPr>
           <w:p>
@@ -11519,7 +11453,6 @@
         <w:tc>
           <w:tcPr>
             <w:tcW w:w="531" w:type="pct"/>
-            <w:shd w:val="clear" w:color="auto" w:fill="auto"/>
             <w:vAlign w:val="center"/>
           </w:tcPr>
           <w:p>
@@ -11544,7 +11477,6 @@
         <w:tc>
           <w:tcPr>
             <w:tcW w:w="417" w:type="pct"/>
-            <w:shd w:val="clear" w:color="auto" w:fill="auto"/>
             <w:vAlign w:val="center"/>
           </w:tcPr>
           <w:p>
@@ -11615,7 +11547,6 @@
         <w:tc>
           <w:tcPr>
             <w:tcW w:w="417" w:type="pct"/>
-            <w:shd w:val="clear" w:color="auto" w:fill="auto"/>
             <w:vAlign w:val="center"/>
           </w:tcPr>
           <w:p>
@@ -11641,7 +11572,6 @@
         <w:tc>
           <w:tcPr>
             <w:tcW w:w="418" w:type="pct"/>
-            <w:shd w:val="clear" w:color="auto" w:fill="auto"/>
             <w:vAlign w:val="center"/>
           </w:tcPr>
           <w:p>
@@ -11665,7 +11595,6 @@
         <w:tc>
           <w:tcPr>
             <w:tcW w:w="366" w:type="pct"/>
-            <w:shd w:val="clear" w:color="auto" w:fill="auto"/>
             <w:vAlign w:val="center"/>
           </w:tcPr>
           <w:p>
@@ -11692,7 +11621,6 @@
         <w:tc>
           <w:tcPr>
             <w:tcW w:w="401" w:type="pct"/>
-            <w:shd w:val="clear" w:color="auto" w:fill="auto"/>
             <w:vAlign w:val="center"/>
           </w:tcPr>
           <w:p>
@@ -11722,7 +11650,6 @@
         <w:tc>
           <w:tcPr>
             <w:tcW w:w="173" w:type="pct"/>
-            <w:shd w:val="clear" w:color="auto" w:fill="auto"/>
             <w:vAlign w:val="center"/>
           </w:tcPr>
           <w:p>
@@ -11759,7 +11686,6 @@
         <w:tc>
           <w:tcPr>
             <w:tcW w:w="887" w:type="pct"/>
-            <w:shd w:val="clear" w:color="auto" w:fill="auto"/>
             <w:vAlign w:val="center"/>
           </w:tcPr>
           <w:p>
@@ -11786,7 +11712,6 @@
         <w:tc>
           <w:tcPr>
             <w:tcW w:w="531" w:type="pct"/>
-            <w:shd w:val="clear" w:color="auto" w:fill="auto"/>
             <w:vAlign w:val="center"/>
           </w:tcPr>
           <w:p>
@@ -11812,7 +11737,6 @@
         <w:tc>
           <w:tcPr>
             <w:tcW w:w="417" w:type="pct"/>
-            <w:shd w:val="clear" w:color="auto" w:fill="auto"/>
             <w:vAlign w:val="center"/>
           </w:tcPr>
           <w:p>
@@ -11885,7 +11809,6 @@
         <w:tc>
           <w:tcPr>
             <w:tcW w:w="417" w:type="pct"/>
-            <w:shd w:val="clear" w:color="auto" w:fill="auto"/>
             <w:vAlign w:val="center"/>
           </w:tcPr>
           <w:p>
@@ -11911,7 +11834,6 @@
         <w:tc>
           <w:tcPr>
             <w:tcW w:w="418" w:type="pct"/>
-            <w:shd w:val="clear" w:color="auto" w:fill="auto"/>
             <w:vAlign w:val="center"/>
           </w:tcPr>
           <w:p>
@@ -11936,7 +11858,6 @@
         <w:tc>
           <w:tcPr>
             <w:tcW w:w="366" w:type="pct"/>
-            <w:shd w:val="clear" w:color="auto" w:fill="auto"/>
             <w:vAlign w:val="center"/>
           </w:tcPr>
           <w:p>
@@ -11962,7 +11883,6 @@
         <w:tc>
           <w:tcPr>
             <w:tcW w:w="401" w:type="pct"/>
-            <w:shd w:val="clear" w:color="auto" w:fill="auto"/>
             <w:vAlign w:val="center"/>
           </w:tcPr>
           <w:p>
@@ -12432,7 +12352,6 @@
         <w:tc>
           <w:tcPr>
             <w:tcW w:w="9326" w:type="dxa"/>
-            <w:shd w:val="clear" w:color="auto" w:fill="auto"/>
           </w:tcPr>
           <w:p>
             <w:pPr>
@@ -12510,7 +12429,6 @@
         <w:tc>
           <w:tcPr>
             <w:tcW w:w="9326" w:type="dxa"/>
-            <w:shd w:val="clear" w:color="auto" w:fill="auto"/>
           </w:tcPr>
           <w:p>
             <w:pPr>
@@ -12590,7 +12508,6 @@
         <w:tc>
           <w:tcPr>
             <w:tcW w:w="9326" w:type="dxa"/>
-            <w:shd w:val="clear" w:color="auto" w:fill="auto"/>
           </w:tcPr>
           <w:p>
             <w:pPr>
@@ -12753,7 +12670,6 @@
         <w:tc>
           <w:tcPr>
             <w:tcW w:w="3057" w:type="dxa"/>
-            <w:shd w:val="clear" w:color="auto" w:fill="auto"/>
             <w:vAlign w:val="center"/>
             <w:hideMark/>
           </w:tcPr>
@@ -12788,7 +12704,6 @@
         <w:tc>
           <w:tcPr>
             <w:tcW w:w="2250" w:type="dxa"/>
-            <w:shd w:val="clear" w:color="auto" w:fill="auto"/>
             <w:vAlign w:val="center"/>
             <w:hideMark/>
           </w:tcPr>
@@ -12823,7 +12738,6 @@
         <w:tc>
           <w:tcPr>
             <w:tcW w:w="1705" w:type="dxa"/>
-            <w:shd w:val="clear" w:color="auto" w:fill="auto"/>
             <w:vAlign w:val="center"/>
             <w:hideMark/>
           </w:tcPr>
@@ -12863,7 +12777,6 @@
         <w:tc>
           <w:tcPr>
             <w:tcW w:w="3057" w:type="dxa"/>
-            <w:shd w:val="clear" w:color="auto" w:fill="auto"/>
             <w:vAlign w:val="center"/>
             <w:hideMark/>
           </w:tcPr>
@@ -12898,7 +12811,6 @@
         <w:tc>
           <w:tcPr>
             <w:tcW w:w="2250" w:type="dxa"/>
-            <w:shd w:val="clear" w:color="auto" w:fill="auto"/>
             <w:vAlign w:val="center"/>
             <w:hideMark/>
           </w:tcPr>
@@ -12922,7 +12834,6 @@
           <w:tcPr>
             <w:tcW w:w="1705" w:type="dxa"/>
             <w:vMerge w:val="restart"/>
-            <w:shd w:val="clear" w:color="auto" w:fill="auto"/>
             <w:vAlign w:val="center"/>
             <w:hideMark/>
           </w:tcPr>
@@ -12967,7 +12878,6 @@
         <w:tc>
           <w:tcPr>
             <w:tcW w:w="3057" w:type="dxa"/>
-            <w:shd w:val="clear" w:color="auto" w:fill="auto"/>
             <w:vAlign w:val="center"/>
           </w:tcPr>
           <w:p>
@@ -12988,7 +12898,6 @@
         <w:tc>
           <w:tcPr>
             <w:tcW w:w="2250" w:type="dxa"/>
-            <w:shd w:val="clear" w:color="auto" w:fill="auto"/>
             <w:vAlign w:val="center"/>
           </w:tcPr>
           <w:p>
@@ -13011,7 +12920,6 @@
           <w:tcPr>
             <w:tcW w:w="1705" w:type="dxa"/>
             <w:vMerge/>
-            <w:shd w:val="clear" w:color="auto" w:fill="auto"/>
             <w:vAlign w:val="center"/>
           </w:tcPr>
           <w:p>
@@ -15502,7 +15410,6 @@
               <w:bottom w:val="single" w:sz="4" w:space="0" w:color="auto"/>
               <w:right w:val="single" w:sz="4" w:space="0" w:color="auto"/>
             </w:tcBorders>
-            <w:shd w:val="clear" w:color="auto" w:fill="auto"/>
             <w:noWrap/>
             <w:vAlign w:val="center"/>
             <w:hideMark/>
@@ -15542,7 +15449,6 @@
               <w:bottom w:val="single" w:sz="4" w:space="0" w:color="auto"/>
               <w:right w:val="single" w:sz="4" w:space="0" w:color="auto"/>
             </w:tcBorders>
-            <w:shd w:val="clear" w:color="auto" w:fill="auto"/>
             <w:noWrap/>
             <w:vAlign w:val="center"/>
             <w:hideMark/>
@@ -15581,7 +15487,6 @@
               <w:bottom w:val="single" w:sz="4" w:space="0" w:color="auto"/>
               <w:right w:val="single" w:sz="4" w:space="0" w:color="auto"/>
             </w:tcBorders>
-            <w:shd w:val="clear" w:color="auto" w:fill="auto"/>
             <w:noWrap/>
             <w:vAlign w:val="center"/>
             <w:hideMark/>
@@ -15620,7 +15525,6 @@
               <w:bottom w:val="single" w:sz="4" w:space="0" w:color="auto"/>
               <w:right w:val="single" w:sz="4" w:space="0" w:color="auto"/>
             </w:tcBorders>
-            <w:shd w:val="clear" w:color="auto" w:fill="auto"/>
             <w:noWrap/>
             <w:vAlign w:val="center"/>
             <w:hideMark/>
@@ -15659,7 +15563,6 @@
               <w:bottom w:val="single" w:sz="4" w:space="0" w:color="auto"/>
               <w:right w:val="single" w:sz="4" w:space="0" w:color="auto"/>
             </w:tcBorders>
-            <w:shd w:val="clear" w:color="auto" w:fill="auto"/>
             <w:noWrap/>
             <w:vAlign w:val="center"/>
             <w:hideMark/>
@@ -15704,7 +15607,6 @@
               <w:left w:val="single" w:sz="4" w:space="0" w:color="auto"/>
               <w:right w:val="single" w:sz="4" w:space="0" w:color="auto"/>
             </w:tcBorders>
-            <w:shd w:val="clear" w:color="auto" w:fill="auto"/>
             <w:noWrap/>
             <w:vAlign w:val="center"/>
             <w:hideMark/>
@@ -15748,7 +15650,6 @@
               <w:bottom w:val="single" w:sz="4" w:space="0" w:color="auto"/>
               <w:right w:val="single" w:sz="4" w:space="0" w:color="auto"/>
             </w:tcBorders>
-            <w:shd w:val="clear" w:color="auto" w:fill="auto"/>
             <w:noWrap/>
             <w:vAlign w:val="center"/>
             <w:hideMark/>
@@ -15783,7 +15684,6 @@
               <w:bottom w:val="single" w:sz="4" w:space="0" w:color="auto"/>
               <w:right w:val="single" w:sz="4" w:space="0" w:color="auto"/>
             </w:tcBorders>
-            <w:shd w:val="clear" w:color="auto" w:fill="auto"/>
             <w:noWrap/>
             <w:vAlign w:val="center"/>
             <w:hideMark/>
@@ -15818,7 +15718,6 @@
               <w:left w:val="nil"/>
               <w:right w:val="single" w:sz="4" w:space="0" w:color="auto"/>
             </w:tcBorders>
-            <w:shd w:val="clear" w:color="auto" w:fill="auto"/>
             <w:noWrap/>
             <w:vAlign w:val="center"/>
             <w:hideMark/>
@@ -15853,7 +15752,6 @@
               <w:left w:val="nil"/>
               <w:right w:val="single" w:sz="4" w:space="0" w:color="auto"/>
             </w:tcBorders>
-            <w:shd w:val="clear" w:color="auto" w:fill="auto"/>
             <w:noWrap/>
             <w:vAlign w:val="center"/>
             <w:hideMark/>
@@ -15894,7 +15792,6 @@
               <w:bottom w:val="single" w:sz="4" w:space="0" w:color="auto"/>
               <w:right w:val="single" w:sz="4" w:space="0" w:color="auto"/>
             </w:tcBorders>
-            <w:shd w:val="clear" w:color="auto" w:fill="auto"/>
             <w:noWrap/>
             <w:vAlign w:val="center"/>
             <w:hideMark/>
@@ -15920,7 +15817,6 @@
               <w:bottom w:val="single" w:sz="4" w:space="0" w:color="auto"/>
               <w:right w:val="single" w:sz="4" w:space="0" w:color="auto"/>
             </w:tcBorders>
-            <w:shd w:val="clear" w:color="auto" w:fill="auto"/>
             <w:noWrap/>
             <w:vAlign w:val="center"/>
             <w:hideMark/>
@@ -15955,7 +15851,6 @@
               <w:bottom w:val="single" w:sz="4" w:space="0" w:color="auto"/>
               <w:right w:val="single" w:sz="4" w:space="0" w:color="auto"/>
             </w:tcBorders>
-            <w:shd w:val="clear" w:color="auto" w:fill="auto"/>
             <w:noWrap/>
             <w:vAlign w:val="center"/>
             <w:hideMark/>
@@ -15990,7 +15885,6 @@
               <w:bottom w:val="single" w:sz="4" w:space="0" w:color="auto"/>
               <w:right w:val="single" w:sz="4" w:space="0" w:color="auto"/>
             </w:tcBorders>
-            <w:shd w:val="clear" w:color="auto" w:fill="auto"/>
             <w:noWrap/>
             <w:vAlign w:val="center"/>
             <w:hideMark/>
@@ -16016,7 +15910,6 @@
               <w:bottom w:val="single" w:sz="4" w:space="0" w:color="auto"/>
               <w:right w:val="single" w:sz="4" w:space="0" w:color="auto"/>
             </w:tcBorders>
-            <w:shd w:val="clear" w:color="auto" w:fill="auto"/>
             <w:noWrap/>
             <w:vAlign w:val="center"/>
             <w:hideMark/>
@@ -16048,7 +15941,6 @@
               <w:bottom w:val="single" w:sz="4" w:space="0" w:color="auto"/>
               <w:right w:val="single" w:sz="4" w:space="0" w:color="auto"/>
             </w:tcBorders>
-            <w:shd w:val="clear" w:color="auto" w:fill="auto"/>
             <w:noWrap/>
             <w:vAlign w:val="center"/>
             <w:hideMark/>
@@ -16083,7 +15975,6 @@
               <w:bottom w:val="single" w:sz="4" w:space="0" w:color="auto"/>
               <w:right w:val="single" w:sz="4" w:space="0" w:color="auto"/>
             </w:tcBorders>
-            <w:shd w:val="clear" w:color="auto" w:fill="auto"/>
             <w:noWrap/>
             <w:vAlign w:val="center"/>
             <w:hideMark/>
@@ -16118,7 +16009,6 @@
               <w:bottom w:val="single" w:sz="4" w:space="0" w:color="auto"/>
               <w:right w:val="single" w:sz="4" w:space="0" w:color="auto"/>
             </w:tcBorders>
-            <w:shd w:val="clear" w:color="auto" w:fill="auto"/>
             <w:noWrap/>
             <w:vAlign w:val="center"/>
             <w:hideMark/>
@@ -16153,7 +16043,6 @@
               <w:bottom w:val="single" w:sz="4" w:space="0" w:color="auto"/>
               <w:right w:val="single" w:sz="4" w:space="0" w:color="auto"/>
             </w:tcBorders>
-            <w:shd w:val="clear" w:color="auto" w:fill="auto"/>
             <w:noWrap/>
             <w:vAlign w:val="center"/>
             <w:hideMark/>
@@ -16188,7 +16077,6 @@
               <w:bottom w:val="single" w:sz="4" w:space="0" w:color="auto"/>
               <w:right w:val="single" w:sz="4" w:space="0" w:color="auto"/>
             </w:tcBorders>
-            <w:shd w:val="clear" w:color="auto" w:fill="auto"/>
             <w:noWrap/>
             <w:vAlign w:val="center"/>
             <w:hideMark/>
@@ -16229,7 +16117,6 @@
               <w:bottom w:val="single" w:sz="4" w:space="0" w:color="auto"/>
               <w:right w:val="single" w:sz="4" w:space="0" w:color="auto"/>
             </w:tcBorders>
-            <w:shd w:val="clear" w:color="auto" w:fill="auto"/>
             <w:noWrap/>
             <w:vAlign w:val="center"/>
           </w:tcPr>
@@ -16263,7 +16150,6 @@
               <w:bottom w:val="single" w:sz="4" w:space="0" w:color="auto"/>
               <w:right w:val="single" w:sz="4" w:space="0" w:color="auto"/>
             </w:tcBorders>
-            <w:shd w:val="clear" w:color="auto" w:fill="auto"/>
             <w:noWrap/>
             <w:vAlign w:val="center"/>
           </w:tcPr>
@@ -16297,7 +16183,6 @@
               <w:bottom w:val="single" w:sz="4" w:space="0" w:color="auto"/>
               <w:right w:val="single" w:sz="4" w:space="0" w:color="auto"/>
             </w:tcBorders>
-            <w:shd w:val="clear" w:color="auto" w:fill="auto"/>
             <w:noWrap/>
             <w:vAlign w:val="center"/>
           </w:tcPr>
@@ -16331,7 +16216,6 @@
               <w:bottom w:val="single" w:sz="4" w:space="0" w:color="auto"/>
               <w:right w:val="single" w:sz="4" w:space="0" w:color="auto"/>
             </w:tcBorders>
-            <w:shd w:val="clear" w:color="auto" w:fill="auto"/>
             <w:noWrap/>
             <w:vAlign w:val="center"/>
           </w:tcPr>
@@ -16365,7 +16249,6 @@
               <w:bottom w:val="single" w:sz="4" w:space="0" w:color="auto"/>
               <w:right w:val="single" w:sz="4" w:space="0" w:color="auto"/>
             </w:tcBorders>
-            <w:shd w:val="clear" w:color="auto" w:fill="auto"/>
             <w:noWrap/>
             <w:vAlign w:val="center"/>
           </w:tcPr>
@@ -16405,7 +16288,6 @@
               <w:bottom w:val="single" w:sz="4" w:space="0" w:color="auto"/>
               <w:right w:val="single" w:sz="4" w:space="0" w:color="auto"/>
             </w:tcBorders>
-            <w:shd w:val="clear" w:color="auto" w:fill="auto"/>
             <w:noWrap/>
             <w:vAlign w:val="center"/>
             <w:hideMark/>
@@ -16440,7 +16322,6 @@
               <w:bottom w:val="single" w:sz="4" w:space="0" w:color="auto"/>
               <w:right w:val="single" w:sz="4" w:space="0" w:color="auto"/>
             </w:tcBorders>
-            <w:shd w:val="clear" w:color="auto" w:fill="auto"/>
             <w:noWrap/>
             <w:vAlign w:val="center"/>
             <w:hideMark/>
@@ -16466,7 +16347,6 @@
               <w:bottom w:val="single" w:sz="4" w:space="0" w:color="auto"/>
               <w:right w:val="single" w:sz="4" w:space="0" w:color="auto"/>
             </w:tcBorders>
-            <w:shd w:val="clear" w:color="auto" w:fill="auto"/>
             <w:noWrap/>
             <w:vAlign w:val="center"/>
             <w:hideMark/>
@@ -16510,7 +16390,6 @@
               <w:bottom w:val="single" w:sz="4" w:space="0" w:color="auto"/>
               <w:right w:val="single" w:sz="4" w:space="0" w:color="auto"/>
             </w:tcBorders>
-            <w:shd w:val="clear" w:color="auto" w:fill="auto"/>
             <w:noWrap/>
             <w:vAlign w:val="center"/>
             <w:hideMark/>
@@ -16545,7 +16424,6 @@
               <w:bottom w:val="single" w:sz="4" w:space="0" w:color="auto"/>
               <w:right w:val="single" w:sz="4" w:space="0" w:color="auto"/>
             </w:tcBorders>
-            <w:shd w:val="clear" w:color="auto" w:fill="auto"/>
             <w:noWrap/>
             <w:vAlign w:val="center"/>
             <w:hideMark/>
@@ -19259,7 +19137,6 @@
               <w:bottom w:val="single" w:sz="6" w:space="0" w:color="auto"/>
               <w:right w:val="single" w:sz="6" w:space="0" w:color="auto"/>
             </w:tcBorders>
-            <w:shd w:val="clear" w:color="auto" w:fill="auto"/>
             <w:vAlign w:val="center"/>
             <w:hideMark/>
           </w:tcPr>
@@ -19304,7 +19181,6 @@
               <w:bottom w:val="single" w:sz="6" w:space="0" w:color="auto"/>
               <w:right w:val="single" w:sz="6" w:space="0" w:color="auto"/>
             </w:tcBorders>
-            <w:shd w:val="clear" w:color="auto" w:fill="auto"/>
             <w:vAlign w:val="center"/>
             <w:hideMark/>
           </w:tcPr>
@@ -19339,7 +19215,6 @@
               <w:bottom w:val="single" w:sz="6" w:space="0" w:color="auto"/>
               <w:right w:val="single" w:sz="6" w:space="0" w:color="auto"/>
             </w:tcBorders>
-            <w:shd w:val="clear" w:color="auto" w:fill="auto"/>
             <w:vAlign w:val="center"/>
             <w:hideMark/>
           </w:tcPr>
@@ -19415,7 +19290,6 @@
               <w:bottom w:val="single" w:sz="6" w:space="0" w:color="auto"/>
               <w:right w:val="single" w:sz="6" w:space="0" w:color="auto"/>
             </w:tcBorders>
-            <w:shd w:val="clear" w:color="auto" w:fill="auto"/>
             <w:vAlign w:val="center"/>
             <w:hideMark/>
           </w:tcPr>
@@ -19456,7 +19330,6 @@
               <w:bottom w:val="single" w:sz="6" w:space="0" w:color="auto"/>
               <w:right w:val="single" w:sz="6" w:space="0" w:color="auto"/>
             </w:tcBorders>
-            <w:shd w:val="clear" w:color="auto" w:fill="auto"/>
             <w:vAlign w:val="center"/>
             <w:hideMark/>
           </w:tcPr>
@@ -19489,7 +19362,6 @@
               <w:bottom w:val="single" w:sz="6" w:space="0" w:color="auto"/>
               <w:right w:val="single" w:sz="6" w:space="0" w:color="auto"/>
             </w:tcBorders>
-            <w:shd w:val="clear" w:color="auto" w:fill="auto"/>
             <w:vAlign w:val="center"/>
             <w:hideMark/>
           </w:tcPr>
@@ -29190,7 +29062,6 @@
               <w:bottom w:val="single" w:sz="6" w:space="0" w:color="auto"/>
               <w:right w:val="single" w:sz="6" w:space="0" w:color="auto"/>
             </w:tcBorders>
-            <w:shd w:val="clear" w:color="auto" w:fill="auto"/>
             <w:vAlign w:val="center"/>
             <w:hideMark/>
           </w:tcPr>
@@ -29234,7 +29105,6 @@
               <w:bottom w:val="single" w:sz="6" w:space="0" w:color="auto"/>
               <w:right w:val="single" w:sz="6" w:space="0" w:color="auto"/>
             </w:tcBorders>
-            <w:shd w:val="clear" w:color="auto" w:fill="auto"/>
             <w:vAlign w:val="center"/>
             <w:hideMark/>
           </w:tcPr>
@@ -29278,7 +29148,6 @@
               <w:bottom w:val="single" w:sz="6" w:space="0" w:color="auto"/>
               <w:right w:val="single" w:sz="6" w:space="0" w:color="auto"/>
             </w:tcBorders>
-            <w:shd w:val="clear" w:color="auto" w:fill="auto"/>
             <w:vAlign w:val="center"/>
             <w:hideMark/>
           </w:tcPr>
@@ -29322,7 +29191,6 @@
               <w:bottom w:val="single" w:sz="6" w:space="0" w:color="auto"/>
               <w:right w:val="single" w:sz="6" w:space="0" w:color="auto"/>
             </w:tcBorders>
-            <w:shd w:val="clear" w:color="auto" w:fill="auto"/>
             <w:vAlign w:val="center"/>
             <w:hideMark/>
           </w:tcPr>
@@ -29366,7 +29234,6 @@
               <w:bottom w:val="single" w:sz="6" w:space="0" w:color="auto"/>
               <w:right w:val="single" w:sz="6" w:space="0" w:color="auto"/>
             </w:tcBorders>
-            <w:shd w:val="clear" w:color="auto" w:fill="auto"/>
             <w:vAlign w:val="center"/>
             <w:hideMark/>
           </w:tcPr>
@@ -29415,7 +29282,6 @@
               <w:bottom w:val="single" w:sz="6" w:space="0" w:color="auto"/>
               <w:right w:val="single" w:sz="6" w:space="0" w:color="auto"/>
             </w:tcBorders>
-            <w:shd w:val="clear" w:color="auto" w:fill="auto"/>
             <w:vAlign w:val="center"/>
             <w:hideMark/>
           </w:tcPr>
@@ -29449,7 +29315,6 @@
               <w:bottom w:val="single" w:sz="6" w:space="0" w:color="auto"/>
               <w:right w:val="single" w:sz="6" w:space="0" w:color="auto"/>
             </w:tcBorders>
-            <w:shd w:val="clear" w:color="auto" w:fill="auto"/>
             <w:vAlign w:val="center"/>
             <w:hideMark/>
           </w:tcPr>
@@ -29483,7 +29348,6 @@
               <w:bottom w:val="single" w:sz="6" w:space="0" w:color="auto"/>
               <w:right w:val="single" w:sz="6" w:space="0" w:color="auto"/>
             </w:tcBorders>
-            <w:shd w:val="clear" w:color="auto" w:fill="auto"/>
             <w:vAlign w:val="center"/>
             <w:hideMark/>
           </w:tcPr>
@@ -29517,7 +29381,6 @@
               <w:bottom w:val="single" w:sz="6" w:space="0" w:color="auto"/>
               <w:right w:val="single" w:sz="6" w:space="0" w:color="auto"/>
             </w:tcBorders>
-            <w:shd w:val="clear" w:color="auto" w:fill="auto"/>
             <w:vAlign w:val="center"/>
             <w:hideMark/>
           </w:tcPr>
@@ -29551,7 +29414,6 @@
               <w:bottom w:val="single" w:sz="6" w:space="0" w:color="auto"/>
               <w:right w:val="single" w:sz="6" w:space="0" w:color="auto"/>
             </w:tcBorders>
-            <w:shd w:val="clear" w:color="auto" w:fill="auto"/>
             <w:vAlign w:val="center"/>
             <w:hideMark/>
           </w:tcPr>
@@ -29590,7 +29452,6 @@
               <w:bottom w:val="single" w:sz="6" w:space="0" w:color="auto"/>
               <w:right w:val="single" w:sz="6" w:space="0" w:color="auto"/>
             </w:tcBorders>
-            <w:shd w:val="clear" w:color="auto" w:fill="auto"/>
             <w:vAlign w:val="center"/>
             <w:hideMark/>
           </w:tcPr>
@@ -29624,7 +29485,6 @@
               <w:bottom w:val="single" w:sz="6" w:space="0" w:color="auto"/>
               <w:right w:val="single" w:sz="6" w:space="0" w:color="auto"/>
             </w:tcBorders>
-            <w:shd w:val="clear" w:color="auto" w:fill="auto"/>
             <w:vAlign w:val="center"/>
             <w:hideMark/>
           </w:tcPr>
@@ -29658,7 +29518,6 @@
               <w:bottom w:val="single" w:sz="6" w:space="0" w:color="auto"/>
               <w:right w:val="single" w:sz="6" w:space="0" w:color="auto"/>
             </w:tcBorders>
-            <w:shd w:val="clear" w:color="auto" w:fill="auto"/>
             <w:vAlign w:val="center"/>
             <w:hideMark/>
           </w:tcPr>
@@ -29692,7 +29551,6 @@
               <w:bottom w:val="single" w:sz="6" w:space="0" w:color="auto"/>
               <w:right w:val="single" w:sz="6" w:space="0" w:color="auto"/>
             </w:tcBorders>
-            <w:shd w:val="clear" w:color="auto" w:fill="auto"/>
             <w:vAlign w:val="center"/>
             <w:hideMark/>
           </w:tcPr>
@@ -29726,7 +29584,6 @@
               <w:bottom w:val="single" w:sz="6" w:space="0" w:color="auto"/>
               <w:right w:val="single" w:sz="6" w:space="0" w:color="auto"/>
             </w:tcBorders>
-            <w:shd w:val="clear" w:color="auto" w:fill="auto"/>
             <w:vAlign w:val="center"/>
             <w:hideMark/>
           </w:tcPr>
@@ -29765,7 +29622,6 @@
               <w:bottom w:val="single" w:sz="6" w:space="0" w:color="auto"/>
               <w:right w:val="single" w:sz="6" w:space="0" w:color="auto"/>
             </w:tcBorders>
-            <w:shd w:val="clear" w:color="auto" w:fill="auto"/>
             <w:vAlign w:val="center"/>
             <w:hideMark/>
           </w:tcPr>
@@ -29799,7 +29655,6 @@
               <w:bottom w:val="single" w:sz="6" w:space="0" w:color="auto"/>
               <w:right w:val="single" w:sz="6" w:space="0" w:color="auto"/>
             </w:tcBorders>
-            <w:shd w:val="clear" w:color="auto" w:fill="auto"/>
             <w:vAlign w:val="center"/>
             <w:hideMark/>
           </w:tcPr>
@@ -29833,7 +29688,6 @@
               <w:bottom w:val="single" w:sz="6" w:space="0" w:color="auto"/>
               <w:right w:val="single" w:sz="6" w:space="0" w:color="auto"/>
             </w:tcBorders>
-            <w:shd w:val="clear" w:color="auto" w:fill="auto"/>
             <w:vAlign w:val="center"/>
             <w:hideMark/>
           </w:tcPr>
@@ -29867,7 +29721,6 @@
               <w:bottom w:val="single" w:sz="6" w:space="0" w:color="auto"/>
               <w:right w:val="single" w:sz="6" w:space="0" w:color="auto"/>
             </w:tcBorders>
-            <w:shd w:val="clear" w:color="auto" w:fill="auto"/>
             <w:vAlign w:val="center"/>
             <w:hideMark/>
           </w:tcPr>
@@ -29901,7 +29754,6 @@
               <w:bottom w:val="single" w:sz="6" w:space="0" w:color="auto"/>
               <w:right w:val="single" w:sz="6" w:space="0" w:color="auto"/>
             </w:tcBorders>
-            <w:shd w:val="clear" w:color="auto" w:fill="auto"/>
             <w:vAlign w:val="center"/>
             <w:hideMark/>
           </w:tcPr>
@@ -29940,7 +29792,6 @@
               <w:bottom w:val="single" w:sz="6" w:space="0" w:color="auto"/>
               <w:right w:val="single" w:sz="6" w:space="0" w:color="auto"/>
             </w:tcBorders>
-            <w:shd w:val="clear" w:color="auto" w:fill="auto"/>
             <w:vAlign w:val="center"/>
             <w:hideMark/>
           </w:tcPr>
@@ -29974,7 +29825,6 @@
               <w:bottom w:val="single" w:sz="6" w:space="0" w:color="auto"/>
               <w:right w:val="single" w:sz="6" w:space="0" w:color="auto"/>
             </w:tcBorders>
-            <w:shd w:val="clear" w:color="auto" w:fill="auto"/>
             <w:vAlign w:val="center"/>
             <w:hideMark/>
           </w:tcPr>
@@ -30008,7 +29858,6 @@
               <w:bottom w:val="single" w:sz="6" w:space="0" w:color="auto"/>
               <w:right w:val="single" w:sz="6" w:space="0" w:color="auto"/>
             </w:tcBorders>
-            <w:shd w:val="clear" w:color="auto" w:fill="auto"/>
             <w:vAlign w:val="center"/>
             <w:hideMark/>
           </w:tcPr>
@@ -30042,7 +29891,6 @@
               <w:bottom w:val="single" w:sz="6" w:space="0" w:color="auto"/>
               <w:right w:val="single" w:sz="6" w:space="0" w:color="auto"/>
             </w:tcBorders>
-            <w:shd w:val="clear" w:color="auto" w:fill="auto"/>
             <w:vAlign w:val="center"/>
             <w:hideMark/>
           </w:tcPr>
@@ -30076,7 +29924,6 @@
               <w:bottom w:val="single" w:sz="6" w:space="0" w:color="auto"/>
               <w:right w:val="single" w:sz="6" w:space="0" w:color="auto"/>
             </w:tcBorders>
-            <w:shd w:val="clear" w:color="auto" w:fill="auto"/>
             <w:vAlign w:val="center"/>
             <w:hideMark/>
           </w:tcPr>
@@ -30116,7 +29963,6 @@
               <w:bottom w:val="single" w:sz="6" w:space="0" w:color="auto"/>
               <w:right w:val="single" w:sz="6" w:space="0" w:color="auto"/>
             </w:tcBorders>
-            <w:shd w:val="clear" w:color="auto" w:fill="auto"/>
             <w:vAlign w:val="center"/>
             <w:hideMark/>
           </w:tcPr>
@@ -30150,7 +29996,6 @@
               <w:bottom w:val="single" w:sz="6" w:space="0" w:color="auto"/>
               <w:right w:val="single" w:sz="6" w:space="0" w:color="auto"/>
             </w:tcBorders>
-            <w:shd w:val="clear" w:color="auto" w:fill="auto"/>
             <w:vAlign w:val="center"/>
             <w:hideMark/>
           </w:tcPr>
@@ -32208,7 +32053,7 @@
           <w:lang w:eastAsia="zh-CN"/>
         </w:rPr>
         <w:drawing>
-          <wp:inline distT="0" distB="0" distL="0" distR="0" wp14:anchorId="02391C56" wp14:editId="77006028">
+          <wp:inline distT="0" distB="0" distL="0" distR="0" wp14:anchorId="02391C56" wp14:editId="371BFE39">
             <wp:extent cx="2476228" cy="2476228"/>
             <wp:effectExtent l="0" t="0" r="635" b="635"/>
             <wp:docPr id="33" name="Picture 33" descr="Chart, radar chart&#10;&#10;Description automatically generated"/>
@@ -33051,7 +32896,6 @@
               <w:bottom w:val="single" w:sz="4" w:space="0" w:color="auto"/>
               <w:right w:val="single" w:sz="4" w:space="0" w:color="auto"/>
             </w:tcBorders>
-            <w:shd w:val="clear" w:color="auto" w:fill="auto"/>
             <w:vAlign w:val="center"/>
             <w:hideMark/>
           </w:tcPr>
@@ -33084,7 +32928,6 @@
               <w:bottom w:val="single" w:sz="4" w:space="0" w:color="auto"/>
               <w:right w:val="single" w:sz="4" w:space="0" w:color="auto"/>
             </w:tcBorders>
-            <w:shd w:val="clear" w:color="auto" w:fill="auto"/>
             <w:vAlign w:val="center"/>
             <w:hideMark/>
           </w:tcPr>
@@ -33117,7 +32960,6 @@
               <w:bottom w:val="single" w:sz="4" w:space="0" w:color="auto"/>
               <w:right w:val="single" w:sz="4" w:space="0" w:color="auto"/>
             </w:tcBorders>
-            <w:shd w:val="clear" w:color="auto" w:fill="auto"/>
             <w:vAlign w:val="center"/>
             <w:hideMark/>
           </w:tcPr>
@@ -33183,7 +33025,6 @@
               <w:bottom w:val="single" w:sz="4" w:space="0" w:color="auto"/>
               <w:right w:val="single" w:sz="6" w:space="0" w:color="auto"/>
             </w:tcBorders>
-            <w:shd w:val="clear" w:color="auto" w:fill="auto"/>
             <w:vAlign w:val="center"/>
             <w:hideMark/>
           </w:tcPr>
@@ -33221,7 +33062,6 @@
               <w:left w:val="single" w:sz="4" w:space="0" w:color="auto"/>
               <w:right w:val="single" w:sz="4" w:space="0" w:color="auto"/>
             </w:tcBorders>
-            <w:shd w:val="clear" w:color="auto" w:fill="auto"/>
             <w:vAlign w:val="center"/>
           </w:tcPr>
           <w:p>
@@ -33290,7 +33130,6 @@
               <w:bottom w:val="single" w:sz="4" w:space="0" w:color="auto"/>
               <w:right w:val="single" w:sz="4" w:space="0" w:color="auto"/>
             </w:tcBorders>
-            <w:shd w:val="clear" w:color="auto" w:fill="auto"/>
             <w:vAlign w:val="center"/>
           </w:tcPr>
           <w:p>
@@ -33320,7 +33159,6 @@
               <w:bottom w:val="single" w:sz="4" w:space="0" w:color="auto"/>
               <w:right w:val="single" w:sz="4" w:space="0" w:color="auto"/>
             </w:tcBorders>
-            <w:shd w:val="clear" w:color="auto" w:fill="auto"/>
             <w:vAlign w:val="center"/>
           </w:tcPr>
           <w:p>
@@ -33379,7 +33217,6 @@
               <w:bottom w:val="single" w:sz="4" w:space="0" w:color="auto"/>
               <w:right w:val="single" w:sz="4" w:space="0" w:color="auto"/>
             </w:tcBorders>
-            <w:shd w:val="clear" w:color="auto" w:fill="auto"/>
             <w:vAlign w:val="center"/>
           </w:tcPr>
           <w:p>
@@ -33415,7 +33252,6 @@
               <w:bottom w:val="single" w:sz="4" w:space="0" w:color="auto"/>
               <w:right w:val="single" w:sz="4" w:space="0" w:color="auto"/>
             </w:tcBorders>
-            <w:shd w:val="clear" w:color="auto" w:fill="auto"/>
             <w:vAlign w:val="center"/>
             <w:hideMark/>
           </w:tcPr>
@@ -33445,7 +33281,6 @@
               <w:bottom w:val="single" w:sz="4" w:space="0" w:color="auto"/>
               <w:right w:val="single" w:sz="4" w:space="0" w:color="auto"/>
             </w:tcBorders>
-            <w:shd w:val="clear" w:color="auto" w:fill="auto"/>
             <w:vAlign w:val="center"/>
             <w:hideMark/>
           </w:tcPr>
@@ -33492,7 +33327,6 @@
               <w:bottom w:val="single" w:sz="4" w:space="0" w:color="auto"/>
               <w:right w:val="single" w:sz="4" w:space="0" w:color="auto"/>
             </w:tcBorders>
-            <w:shd w:val="clear" w:color="auto" w:fill="auto"/>
             <w:vAlign w:val="center"/>
             <w:hideMark/>
           </w:tcPr>
@@ -33560,7 +33394,6 @@
               <w:bottom w:val="single" w:sz="4" w:space="0" w:color="auto"/>
               <w:right w:val="single" w:sz="4" w:space="0" w:color="auto"/>
             </w:tcBorders>
-            <w:shd w:val="clear" w:color="auto" w:fill="auto"/>
             <w:vAlign w:val="center"/>
             <w:hideMark/>
           </w:tcPr>
@@ -33600,7 +33433,6 @@
               <w:bottom w:val="single" w:sz="4" w:space="0" w:color="auto"/>
               <w:right w:val="single" w:sz="4" w:space="0" w:color="auto"/>
             </w:tcBorders>
-            <w:shd w:val="clear" w:color="auto" w:fill="auto"/>
             <w:vAlign w:val="center"/>
             <w:hideMark/>
           </w:tcPr>
@@ -33632,7 +33464,6 @@
               <w:bottom w:val="single" w:sz="6" w:space="0" w:color="auto"/>
               <w:right w:val="single" w:sz="6" w:space="0" w:color="auto"/>
             </w:tcBorders>
-            <w:shd w:val="clear" w:color="auto" w:fill="auto"/>
             <w:vAlign w:val="center"/>
             <w:hideMark/>
           </w:tcPr>
@@ -39147,7 +38978,6 @@
         <w:tc>
           <w:tcPr>
             <w:tcW w:w="1304" w:type="dxa"/>
-            <w:shd w:val="clear" w:color="auto" w:fill="auto"/>
             <w:vAlign w:val="center"/>
             <w:hideMark/>
           </w:tcPr>
@@ -39172,7 +39002,6 @@
         <w:tc>
           <w:tcPr>
             <w:tcW w:w="1232" w:type="dxa"/>
-            <w:shd w:val="clear" w:color="auto" w:fill="auto"/>
             <w:vAlign w:val="center"/>
             <w:hideMark/>
           </w:tcPr>
@@ -39302,7 +39131,6 @@
         <w:tc>
           <w:tcPr>
             <w:tcW w:w="1231" w:type="dxa"/>
-            <w:shd w:val="clear" w:color="auto" w:fill="auto"/>
             <w:vAlign w:val="center"/>
             <w:hideMark/>
           </w:tcPr>
@@ -39327,7 +39155,6 @@
         <w:tc>
           <w:tcPr>
             <w:tcW w:w="1346" w:type="dxa"/>
-            <w:shd w:val="clear" w:color="auto" w:fill="auto"/>
             <w:vAlign w:val="center"/>
             <w:hideMark/>
           </w:tcPr>
@@ -39380,7 +39207,6 @@
         <w:tc>
           <w:tcPr>
             <w:tcW w:w="1176" w:type="dxa"/>
-            <w:shd w:val="clear" w:color="auto" w:fill="auto"/>
             <w:vAlign w:val="center"/>
             <w:hideMark/>
           </w:tcPr>
@@ -39405,7 +39231,6 @@
         <w:tc>
           <w:tcPr>
             <w:tcW w:w="1271" w:type="dxa"/>
-            <w:shd w:val="clear" w:color="auto" w:fill="auto"/>
             <w:vAlign w:val="center"/>
             <w:hideMark/>
           </w:tcPr>
@@ -39452,7 +39277,6 @@
         <w:tc>
           <w:tcPr>
             <w:tcW w:w="1304" w:type="dxa"/>
-            <w:shd w:val="clear" w:color="auto" w:fill="auto"/>
             <w:hideMark/>
           </w:tcPr>
           <w:p>
@@ -39477,7 +39301,6 @@
         <w:tc>
           <w:tcPr>
             <w:tcW w:w="1232" w:type="dxa"/>
-            <w:shd w:val="clear" w:color="auto" w:fill="auto"/>
             <w:hideMark/>
           </w:tcPr>
           <w:p>
@@ -39541,7 +39364,6 @@
         <w:tc>
           <w:tcPr>
             <w:tcW w:w="1231" w:type="dxa"/>
-            <w:shd w:val="clear" w:color="auto" w:fill="auto"/>
             <w:hideMark/>
           </w:tcPr>
           <w:p>
@@ -39569,7 +39391,6 @@
         <w:tc>
           <w:tcPr>
             <w:tcW w:w="1346" w:type="dxa"/>
-            <w:shd w:val="clear" w:color="auto" w:fill="auto"/>
             <w:hideMark/>
           </w:tcPr>
           <w:p>
@@ -39591,7 +39412,6 @@
         <w:tc>
           <w:tcPr>
             <w:tcW w:w="1176" w:type="dxa"/>
-            <w:shd w:val="clear" w:color="auto" w:fill="auto"/>
             <w:hideMark/>
           </w:tcPr>
           <w:p>
@@ -39625,7 +39445,6 @@
         <w:tc>
           <w:tcPr>
             <w:tcW w:w="1271" w:type="dxa"/>
-            <w:shd w:val="clear" w:color="auto" w:fill="auto"/>
             <w:hideMark/>
           </w:tcPr>
           <w:p>
@@ -46217,7 +46036,6 @@
         <w:tc>
           <w:tcPr>
             <w:tcW w:w="1691" w:type="pct"/>
-            <w:shd w:val="clear" w:color="auto" w:fill="auto"/>
             <w:vAlign w:val="center"/>
             <w:hideMark/>
           </w:tcPr>
@@ -46242,7 +46060,6 @@
         <w:tc>
           <w:tcPr>
             <w:tcW w:w="1339" w:type="pct"/>
-            <w:shd w:val="clear" w:color="auto" w:fill="auto"/>
             <w:vAlign w:val="center"/>
             <w:hideMark/>
           </w:tcPr>
@@ -46267,7 +46084,6 @@
         <w:tc>
           <w:tcPr>
             <w:tcW w:w="1489" w:type="pct"/>
-            <w:shd w:val="clear" w:color="auto" w:fill="auto"/>
             <w:vAlign w:val="center"/>
             <w:hideMark/>
           </w:tcPr>
@@ -46292,7 +46108,6 @@
         <w:tc>
           <w:tcPr>
             <w:tcW w:w="481" w:type="pct"/>
-            <w:shd w:val="clear" w:color="auto" w:fill="auto"/>
             <w:vAlign w:val="center"/>
             <w:hideMark/>
           </w:tcPr>
@@ -46323,7 +46138,6 @@
         <w:tc>
           <w:tcPr>
             <w:tcW w:w="1691" w:type="pct"/>
-            <w:shd w:val="clear" w:color="auto" w:fill="auto"/>
             <w:vAlign w:val="center"/>
           </w:tcPr>
           <w:p>
@@ -46383,7 +46197,6 @@
         <w:tc>
           <w:tcPr>
             <w:tcW w:w="1339" w:type="pct"/>
-            <w:shd w:val="clear" w:color="auto" w:fill="auto"/>
             <w:vAlign w:val="center"/>
           </w:tcPr>
           <w:p>
@@ -46417,7 +46230,6 @@
         <w:tc>
           <w:tcPr>
             <w:tcW w:w="1489" w:type="pct"/>
-            <w:shd w:val="clear" w:color="auto" w:fill="auto"/>
             <w:vAlign w:val="center"/>
           </w:tcPr>
           <w:p>
@@ -46451,7 +46263,6 @@
         <w:tc>
           <w:tcPr>
             <w:tcW w:w="481" w:type="pct"/>
-            <w:shd w:val="clear" w:color="auto" w:fill="auto"/>
             <w:vAlign w:val="center"/>
           </w:tcPr>
           <w:p>
@@ -46491,7 +46302,6 @@
         <w:tc>
           <w:tcPr>
             <w:tcW w:w="1691" w:type="pct"/>
-            <w:shd w:val="clear" w:color="auto" w:fill="auto"/>
             <w:vAlign w:val="center"/>
           </w:tcPr>
           <w:p>
@@ -46522,7 +46332,6 @@
         <w:tc>
           <w:tcPr>
             <w:tcW w:w="1339" w:type="pct"/>
-            <w:shd w:val="clear" w:color="auto" w:fill="auto"/>
             <w:vAlign w:val="center"/>
           </w:tcPr>
           <w:p>
@@ -46556,7 +46365,6 @@
         <w:tc>
           <w:tcPr>
             <w:tcW w:w="1489" w:type="pct"/>
-            <w:shd w:val="clear" w:color="auto" w:fill="auto"/>
             <w:vAlign w:val="center"/>
           </w:tcPr>
           <w:p>
@@ -46590,7 +46398,6 @@
         <w:tc>
           <w:tcPr>
             <w:tcW w:w="481" w:type="pct"/>
-            <w:shd w:val="clear" w:color="auto" w:fill="auto"/>
             <w:vAlign w:val="center"/>
           </w:tcPr>
           <w:p>
@@ -46636,7 +46443,6 @@
         <w:tc>
           <w:tcPr>
             <w:tcW w:w="1691" w:type="pct"/>
-            <w:shd w:val="clear" w:color="auto" w:fill="auto"/>
             <w:vAlign w:val="center"/>
           </w:tcPr>
           <w:p>
@@ -46657,7 +46463,6 @@
         <w:tc>
           <w:tcPr>
             <w:tcW w:w="1339" w:type="pct"/>
-            <w:shd w:val="clear" w:color="auto" w:fill="auto"/>
             <w:vAlign w:val="center"/>
           </w:tcPr>
           <w:p>
@@ -46673,7 +46478,6 @@
         <w:tc>
           <w:tcPr>
             <w:tcW w:w="1489" w:type="pct"/>
-            <w:shd w:val="clear" w:color="auto" w:fill="auto"/>
             <w:vAlign w:val="center"/>
           </w:tcPr>
           <w:p>
@@ -46689,7 +46493,6 @@
         <w:tc>
           <w:tcPr>
             <w:tcW w:w="481" w:type="pct"/>
-            <w:shd w:val="clear" w:color="auto" w:fill="auto"/>
             <w:vAlign w:val="center"/>
           </w:tcPr>
           <w:p>
@@ -46717,7 +46520,6 @@
         <w:tc>
           <w:tcPr>
             <w:tcW w:w="1691" w:type="pct"/>
-            <w:shd w:val="clear" w:color="auto" w:fill="auto"/>
             <w:vAlign w:val="center"/>
             <w:hideMark/>
           </w:tcPr>
@@ -46739,7 +46541,6 @@
         <w:tc>
           <w:tcPr>
             <w:tcW w:w="1339" w:type="pct"/>
-            <w:shd w:val="clear" w:color="auto" w:fill="auto"/>
             <w:vAlign w:val="center"/>
             <w:hideMark/>
           </w:tcPr>
@@ -46798,7 +46599,6 @@
         <w:tc>
           <w:tcPr>
             <w:tcW w:w="1489" w:type="pct"/>
-            <w:shd w:val="clear" w:color="auto" w:fill="auto"/>
             <w:vAlign w:val="center"/>
             <w:hideMark/>
           </w:tcPr>
@@ -46829,7 +46629,6 @@
         <w:tc>
           <w:tcPr>
             <w:tcW w:w="481" w:type="pct"/>
-            <w:shd w:val="clear" w:color="auto" w:fill="auto"/>
             <w:vAlign w:val="center"/>
             <w:hideMark/>
           </w:tcPr>
@@ -46866,7 +46665,6 @@
           <w:tcPr>
             <w:tcW w:w="4519" w:type="pct"/>
             <w:gridSpan w:val="3"/>
-            <w:shd w:val="clear" w:color="auto" w:fill="auto"/>
             <w:vAlign w:val="center"/>
             <w:hideMark/>
           </w:tcPr>
@@ -46890,7 +46688,6 @@
         <w:tc>
           <w:tcPr>
             <w:tcW w:w="481" w:type="pct"/>
-            <w:shd w:val="clear" w:color="auto" w:fill="auto"/>
             <w:vAlign w:val="center"/>
             <w:hideMark/>
           </w:tcPr>
@@ -60225,6 +60022,15 @@
 </file>
 
 <file path=customXml/item1.xml><?xml version="1.0" encoding="utf-8"?>
+<p:properties xmlns:p="http://schemas.microsoft.com/office/2006/metadata/properties" xmlns:xsi="http://www.w3.org/2001/XMLSchema-instance" xmlns:pc="http://schemas.microsoft.com/office/infopath/2007/PartnerControls">
+  <documentManagement>
+    <_ip_UnifiedCompliancePolicyUIAction xmlns="http://schemas.microsoft.com/sharepoint/v3" xsi:nil="true"/>
+    <_ip_UnifiedCompliancePolicyProperties xmlns="http://schemas.microsoft.com/sharepoint/v3" xsi:nil="true"/>
+  </documentManagement>
+</p:properties>
+</file>
+
+<file path=customXml/item2.xml><?xml version="1.0" encoding="utf-8"?>
 <?mso-contentType ?>
 <FormTemplates xmlns="http://schemas.microsoft.com/sharepoint/v3/contenttype/forms">
   <Display>DocumentLibraryForm</Display>
@@ -60233,20 +60039,7 @@
 </FormTemplates>
 </file>
 
-<file path=customXml/item2.xml><?xml version="1.0" encoding="utf-8"?>
-<p:properties xmlns:p="http://schemas.microsoft.com/office/2006/metadata/properties" xmlns:xsi="http://www.w3.org/2001/XMLSchema-instance" xmlns:pc="http://schemas.microsoft.com/office/infopath/2007/PartnerControls">
-  <documentManagement>
-    <_ip_UnifiedCompliancePolicyUIAction xmlns="http://schemas.microsoft.com/sharepoint/v3" xsi:nil="true"/>
-    <_ip_UnifiedCompliancePolicyProperties xmlns="http://schemas.microsoft.com/sharepoint/v3" xsi:nil="true"/>
-  </documentManagement>
-</p:properties>
-</file>
-
 <file path=customXml/item3.xml><?xml version="1.0" encoding="utf-8"?>
-<b:Sources xmlns:b="http://schemas.openxmlformats.org/officeDocument/2006/bibliography" xmlns="http://schemas.openxmlformats.org/officeDocument/2006/bibliography" SelectedStyle="\APASixthEditionOfficeOnline.xsl" StyleName="APA" Version="6"/>
-</file>
-
-<file path=customXml/item4.xml><?xml version="1.0" encoding="utf-8"?>
 <ct:contentTypeSchema xmlns:ct="http://schemas.microsoft.com/office/2006/metadata/contentType" xmlns:ma="http://schemas.microsoft.com/office/2006/metadata/properties/metaAttributes" ct:_="" ma:_="" ma:contentTypeName="Document" ma:contentTypeID="0x0101005D6B8665D0E8744598A412E2D0789087" ma:contentTypeVersion="16" ma:contentTypeDescription="Create a new document." ma:contentTypeScope="" ma:versionID="29998de3e81ba7e0a1b2040d7e531ea9">
   <xsd:schema xmlns:xsd="http://www.w3.org/2001/XMLSchema" xmlns:xs="http://www.w3.org/2001/XMLSchema" xmlns:p="http://schemas.microsoft.com/office/2006/metadata/properties" xmlns:ns1="http://schemas.microsoft.com/sharepoint/v3" xmlns:ns3="2a35acab-d295-4eef-897c-28fedbfb46f3" xmlns:ns4="e3c06030-9ce0-4949-a95a-7e76d92403cb" targetNamespace="http://schemas.microsoft.com/office/2006/metadata/properties" ma:root="true" ma:fieldsID="5e8830bcb8cb16c20e7f9ee0652cbefb" ns1:_="" ns3:_="" ns4:_="">
     <xsd:import namespace="http://schemas.microsoft.com/sharepoint/v3"/>
@@ -60492,15 +60285,11 @@
 </ct:contentTypeSchema>
 </file>
 
-<file path=customXml/itemProps1.xml><?xml version="1.0" encoding="utf-8"?>
-<ds:datastoreItem xmlns:ds="http://schemas.openxmlformats.org/officeDocument/2006/customXml" ds:itemID="{A2DF783A-F21D-4FE6-9DB7-21A7ABA67819}">
-  <ds:schemaRefs>
-    <ds:schemaRef ds:uri="http://schemas.microsoft.com/sharepoint/v3/contenttype/forms"/>
-  </ds:schemaRefs>
-</ds:datastoreItem>
+<file path=customXml/item4.xml><?xml version="1.0" encoding="utf-8"?>
+<b:Sources xmlns:b="http://schemas.openxmlformats.org/officeDocument/2006/bibliography" xmlns="http://schemas.openxmlformats.org/officeDocument/2006/bibliography" SelectedStyle="\APASixthEditionOfficeOnline.xsl" StyleName="APA" Version="6"/>
 </file>
 
-<file path=customXml/itemProps2.xml><?xml version="1.0" encoding="utf-8"?>
+<file path=customXml/itemProps1.xml><?xml version="1.0" encoding="utf-8"?>
 <ds:datastoreItem xmlns:ds="http://schemas.openxmlformats.org/officeDocument/2006/customXml" ds:itemID="{6037AFF9-7373-40B2-B4AB-D603D7BF8CFA}">
   <ds:schemaRefs>
     <ds:schemaRef ds:uri="http://schemas.microsoft.com/office/2006/metadata/properties"/>
@@ -60510,15 +60299,15 @@
 </ds:datastoreItem>
 </file>
 
-<file path=customXml/itemProps3.xml><?xml version="1.0" encoding="utf-8"?>
-<ds:datastoreItem xmlns:ds="http://schemas.openxmlformats.org/officeDocument/2006/customXml" ds:itemID="{83BFB347-1592-4A15-B22B-38317197E253}">
+<file path=customXml/itemProps2.xml><?xml version="1.0" encoding="utf-8"?>
+<ds:datastoreItem xmlns:ds="http://schemas.openxmlformats.org/officeDocument/2006/customXml" ds:itemID="{A2DF783A-F21D-4FE6-9DB7-21A7ABA67819}">
   <ds:schemaRefs>
-    <ds:schemaRef ds:uri="http://schemas.openxmlformats.org/officeDocument/2006/bibliography"/>
+    <ds:schemaRef ds:uri="http://schemas.microsoft.com/sharepoint/v3/contenttype/forms"/>
   </ds:schemaRefs>
 </ds:datastoreItem>
 </file>
 
-<file path=customXml/itemProps4.xml><?xml version="1.0" encoding="utf-8"?>
+<file path=customXml/itemProps3.xml><?xml version="1.0" encoding="utf-8"?>
 <ds:datastoreItem xmlns:ds="http://schemas.openxmlformats.org/officeDocument/2006/customXml" ds:itemID="{BF6A054B-2BE6-4E48-967D-BD3ADE589521}">
   <ds:schemaRefs>
     <ds:schemaRef ds:uri="http://schemas.microsoft.com/office/2006/metadata/contentType"/>
@@ -60536,4 +60325,12 @@
     <ds:schemaRef ds:uri="http://schemas.microsoft.com/internal/obd"/>
   </ds:schemaRefs>
 </ds:datastoreItem>
+</file>
+
+<file path=customXml/itemProps4.xml><?xml version="1.0" encoding="utf-8"?>
+<ds:datastoreItem xmlns:ds="http://schemas.openxmlformats.org/officeDocument/2006/customXml" ds:itemID="{83BFB347-1592-4A15-B22B-38317197E253}">
+  <ds:schemaRefs>
+    <ds:schemaRef ds:uri="http://schemas.openxmlformats.org/officeDocument/2006/bibliography"/>
+  </ds:schemaRefs>
+</ds:datastoreItem>
 </file>
</xml_diff>

<commit_message>
update rec table summary calculatoin check
</commit_message>
<xml_diff>
--- a/docs/report1/LS2502 - Final Draft R2.docx
+++ b/docs/report1/LS2502 - Final Draft R2.docx
@@ -10725,7 +10725,7 @@
                 <w:sz w:val="16"/>
                 <w:szCs w:val="16"/>
               </w:rPr>
-              <w:t>222</w:t>
+              <w:t>2</w:t>
             </w:r>
           </w:p>
         </w:tc>
@@ -32053,7 +32053,7 @@
           <w:lang w:eastAsia="zh-CN"/>
         </w:rPr>
         <w:drawing>
-          <wp:inline distT="0" distB="0" distL="0" distR="0" wp14:anchorId="02391C56" wp14:editId="371BFE39">
+          <wp:inline distT="0" distB="0" distL="0" distR="0" wp14:anchorId="02391C56" wp14:editId="74892FE8">
             <wp:extent cx="2476228" cy="2476228"/>
             <wp:effectExtent l="0" t="0" r="635" b="635"/>
             <wp:docPr id="33" name="Picture 33" descr="Chart, radar chart&#10;&#10;Description automatically generated"/>
@@ -60022,6 +60022,15 @@
 </file>
 
 <file path=customXml/item1.xml><?xml version="1.0" encoding="utf-8"?>
+<?mso-contentType ?>
+<FormTemplates xmlns="http://schemas.microsoft.com/sharepoint/v3/contenttype/forms">
+  <Display>DocumentLibraryForm</Display>
+  <Edit>DocumentLibraryForm</Edit>
+  <New>DocumentLibraryForm</New>
+</FormTemplates>
+</file>
+
+<file path=customXml/item2.xml><?xml version="1.0" encoding="utf-8"?>
 <p:properties xmlns:p="http://schemas.microsoft.com/office/2006/metadata/properties" xmlns:xsi="http://www.w3.org/2001/XMLSchema-instance" xmlns:pc="http://schemas.microsoft.com/office/infopath/2007/PartnerControls">
   <documentManagement>
     <_ip_UnifiedCompliancePolicyUIAction xmlns="http://schemas.microsoft.com/sharepoint/v3" xsi:nil="true"/>
@@ -60030,16 +60039,11 @@
 </p:properties>
 </file>
 
-<file path=customXml/item2.xml><?xml version="1.0" encoding="utf-8"?>
-<?mso-contentType ?>
-<FormTemplates xmlns="http://schemas.microsoft.com/sharepoint/v3/contenttype/forms">
-  <Display>DocumentLibraryForm</Display>
-  <Edit>DocumentLibraryForm</Edit>
-  <New>DocumentLibraryForm</New>
-</FormTemplates>
+<file path=customXml/item3.xml><?xml version="1.0" encoding="utf-8"?>
+<b:Sources xmlns:b="http://schemas.openxmlformats.org/officeDocument/2006/bibliography" xmlns="http://schemas.openxmlformats.org/officeDocument/2006/bibliography" SelectedStyle="\APASixthEditionOfficeOnline.xsl" StyleName="APA" Version="6"/>
 </file>
 
-<file path=customXml/item3.xml><?xml version="1.0" encoding="utf-8"?>
+<file path=customXml/item4.xml><?xml version="1.0" encoding="utf-8"?>
 <ct:contentTypeSchema xmlns:ct="http://schemas.microsoft.com/office/2006/metadata/contentType" xmlns:ma="http://schemas.microsoft.com/office/2006/metadata/properties/metaAttributes" ct:_="" ma:_="" ma:contentTypeName="Document" ma:contentTypeID="0x0101005D6B8665D0E8744598A412E2D0789087" ma:contentTypeVersion="16" ma:contentTypeDescription="Create a new document." ma:contentTypeScope="" ma:versionID="29998de3e81ba7e0a1b2040d7e531ea9">
   <xsd:schema xmlns:xsd="http://www.w3.org/2001/XMLSchema" xmlns:xs="http://www.w3.org/2001/XMLSchema" xmlns:p="http://schemas.microsoft.com/office/2006/metadata/properties" xmlns:ns1="http://schemas.microsoft.com/sharepoint/v3" xmlns:ns3="2a35acab-d295-4eef-897c-28fedbfb46f3" xmlns:ns4="e3c06030-9ce0-4949-a95a-7e76d92403cb" targetNamespace="http://schemas.microsoft.com/office/2006/metadata/properties" ma:root="true" ma:fieldsID="5e8830bcb8cb16c20e7f9ee0652cbefb" ns1:_="" ns3:_="" ns4:_="">
     <xsd:import namespace="http://schemas.microsoft.com/sharepoint/v3"/>
@@ -60285,11 +60289,15 @@
 </ct:contentTypeSchema>
 </file>
 
-<file path=customXml/item4.xml><?xml version="1.0" encoding="utf-8"?>
-<b:Sources xmlns:b="http://schemas.openxmlformats.org/officeDocument/2006/bibliography" xmlns="http://schemas.openxmlformats.org/officeDocument/2006/bibliography" SelectedStyle="\APASixthEditionOfficeOnline.xsl" StyleName="APA" Version="6"/>
+<file path=customXml/itemProps1.xml><?xml version="1.0" encoding="utf-8"?>
+<ds:datastoreItem xmlns:ds="http://schemas.openxmlformats.org/officeDocument/2006/customXml" ds:itemID="{A2DF783A-F21D-4FE6-9DB7-21A7ABA67819}">
+  <ds:schemaRefs>
+    <ds:schemaRef ds:uri="http://schemas.microsoft.com/sharepoint/v3/contenttype/forms"/>
+  </ds:schemaRefs>
+</ds:datastoreItem>
 </file>
 
-<file path=customXml/itemProps1.xml><?xml version="1.0" encoding="utf-8"?>
+<file path=customXml/itemProps2.xml><?xml version="1.0" encoding="utf-8"?>
 <ds:datastoreItem xmlns:ds="http://schemas.openxmlformats.org/officeDocument/2006/customXml" ds:itemID="{6037AFF9-7373-40B2-B4AB-D603D7BF8CFA}">
   <ds:schemaRefs>
     <ds:schemaRef ds:uri="http://schemas.microsoft.com/office/2006/metadata/properties"/>
@@ -60299,15 +60307,15 @@
 </ds:datastoreItem>
 </file>
 
-<file path=customXml/itemProps2.xml><?xml version="1.0" encoding="utf-8"?>
-<ds:datastoreItem xmlns:ds="http://schemas.openxmlformats.org/officeDocument/2006/customXml" ds:itemID="{A2DF783A-F21D-4FE6-9DB7-21A7ABA67819}">
+<file path=customXml/itemProps3.xml><?xml version="1.0" encoding="utf-8"?>
+<ds:datastoreItem xmlns:ds="http://schemas.openxmlformats.org/officeDocument/2006/customXml" ds:itemID="{83BFB347-1592-4A15-B22B-38317197E253}">
   <ds:schemaRefs>
-    <ds:schemaRef ds:uri="http://schemas.microsoft.com/sharepoint/v3/contenttype/forms"/>
+    <ds:schemaRef ds:uri="http://schemas.openxmlformats.org/officeDocument/2006/bibliography"/>
   </ds:schemaRefs>
 </ds:datastoreItem>
 </file>
 
-<file path=customXml/itemProps3.xml><?xml version="1.0" encoding="utf-8"?>
+<file path=customXml/itemProps4.xml><?xml version="1.0" encoding="utf-8"?>
 <ds:datastoreItem xmlns:ds="http://schemas.openxmlformats.org/officeDocument/2006/customXml" ds:itemID="{BF6A054B-2BE6-4E48-967D-BD3ADE589521}">
   <ds:schemaRefs>
     <ds:schemaRef ds:uri="http://schemas.microsoft.com/office/2006/metadata/contentType"/>
@@ -60325,12 +60333,4 @@
     <ds:schemaRef ds:uri="http://schemas.microsoft.com/internal/obd"/>
   </ds:schemaRefs>
 </ds:datastoreItem>
-</file>
-
-<file path=customXml/itemProps4.xml><?xml version="1.0" encoding="utf-8"?>
-<ds:datastoreItem xmlns:ds="http://schemas.openxmlformats.org/officeDocument/2006/customXml" ds:itemID="{83BFB347-1592-4A15-B22B-38317197E253}">
-  <ds:schemaRefs>
-    <ds:schemaRef ds:uri="http://schemas.openxmlformats.org/officeDocument/2006/bibliography"/>
-  </ds:schemaRefs>
-</ds:datastoreItem>
 </file>
</xml_diff>